<commit_message>
Update Wyscout teamsheet template.docx
</commit_message>
<xml_diff>
--- a/Wyscout teamsheet template.docx
+++ b/Wyscout teamsheet template.docx
@@ -5,124 +5,125 @@
     <w:p>
       <w:pPr>
         <w:pStyle w:val="Normal1"/>
+        <w:spacing w:before="600" w:after="120"/>
+        <w:jc w:val="center"/>
       </w:pPr>
       <w:r>
         <w:rPr>
+          <w:b/>
           <w:noProof/>
         </w:rPr>
         <w:drawing>
-          <wp:anchor distT="114300" distB="114300" distL="114300" distR="114300" simplePos="0" relativeHeight="251658240" behindDoc="1" locked="0" layoutInCell="1" allowOverlap="1" wp14:anchorId="4372B80B" wp14:editId="230B62B4">
-            <wp:simplePos x="0" y="0"/>
-            <wp:positionH relativeFrom="page">
-              <wp:posOffset>1771650</wp:posOffset>
+          <wp:anchor distT="0" distB="0" distL="114300" distR="114300" simplePos="0" relativeHeight="251658240" behindDoc="1" locked="0" layoutInCell="1" allowOverlap="1" wp14:anchorId="376E03B1" wp14:editId="1EE7A42B">
+            <wp:simplePos x="1868557" y="834887"/>
+            <wp:positionH relativeFrom="margin">
+              <wp:align>left</wp:align>
             </wp:positionH>
-            <wp:positionV relativeFrom="page">
-              <wp:posOffset>619125</wp:posOffset>
+            <wp:positionV relativeFrom="margin">
+              <wp:align>top</wp:align>
             </wp:positionV>
-            <wp:extent cx="930519" cy="190500"/>
+            <wp:extent cx="1083518" cy="180000"/>
             <wp:effectExtent l="0" t="0" r="0" b="0"/>
             <wp:wrapNone/>
-            <wp:docPr id="2" name="image1.png"/>
-            <wp:cNvGraphicFramePr/>
+            <wp:docPr id="1464915431" name="Picture 2"/>
+            <wp:cNvGraphicFramePr>
+              <a:graphicFrameLocks xmlns:a="http://schemas.openxmlformats.org/drawingml/2006/main" noChangeAspect="1"/>
+            </wp:cNvGraphicFramePr>
             <a:graphic xmlns:a="http://schemas.openxmlformats.org/drawingml/2006/main">
               <a:graphicData uri="http://schemas.openxmlformats.org/drawingml/2006/picture">
                 <pic:pic xmlns:pic="http://schemas.openxmlformats.org/drawingml/2006/picture">
                   <pic:nvPicPr>
-                    <pic:cNvPr id="0" name="image1.png"/>
-                    <pic:cNvPicPr preferRelativeResize="0"/>
+                    <pic:cNvPr id="0" name="Picture 3"/>
+                    <pic:cNvPicPr>
+                      <a:picLocks noChangeAspect="1" noChangeArrowheads="1"/>
+                    </pic:cNvPicPr>
                   </pic:nvPicPr>
                   <pic:blipFill>
-                    <a:blip r:embed="rId4" cstate="print"/>
+                    <a:blip r:embed="rId7" cstate="print">
+                      <a:extLst>
+                        <a:ext uri="{28A0092B-C50C-407E-A947-70E740481C1C}">
+                          <a14:useLocalDpi xmlns:a14="http://schemas.microsoft.com/office/drawing/2010/main" val="0"/>
+                        </a:ext>
+                      </a:extLst>
+                    </a:blip>
                     <a:srcRect/>
                     <a:stretch>
                       <a:fillRect/>
                     </a:stretch>
                   </pic:blipFill>
-                  <pic:spPr>
+                  <pic:spPr bwMode="auto">
                     <a:xfrm>
                       <a:off x="0" y="0"/>
-                      <a:ext cx="930519" cy="190500"/>
+                      <a:ext cx="1083518" cy="180000"/>
                     </a:xfrm>
                     <a:prstGeom prst="rect">
                       <a:avLst/>
                     </a:prstGeom>
-                    <a:ln/>
+                    <a:noFill/>
+                    <a:ln>
+                      <a:noFill/>
+                    </a:ln>
                   </pic:spPr>
                 </pic:pic>
               </a:graphicData>
             </a:graphic>
+            <wp14:sizeRelH relativeFrom="page">
+              <wp14:pctWidth>0</wp14:pctWidth>
+            </wp14:sizeRelH>
+            <wp14:sizeRelV relativeFrom="page">
+              <wp14:pctHeight>0</wp14:pctHeight>
+            </wp14:sizeRelV>
           </wp:anchor>
         </w:drawing>
       </w:r>
       <w:r>
         <w:rPr>
-          <w:noProof/>
-        </w:rPr>
-        <w:drawing>
-          <wp:anchor distT="114300" distB="114300" distL="114300" distR="114300" simplePos="0" relativeHeight="251659264" behindDoc="1" locked="0" layoutInCell="1" allowOverlap="1" wp14:anchorId="06D64BAA" wp14:editId="66217C0B">
-            <wp:simplePos x="0" y="0"/>
-            <wp:positionH relativeFrom="page">
-              <wp:posOffset>914400</wp:posOffset>
-            </wp:positionH>
-            <wp:positionV relativeFrom="page">
-              <wp:posOffset>600075</wp:posOffset>
-            </wp:positionV>
-            <wp:extent cx="595313" cy="194621"/>
-            <wp:effectExtent l="0" t="0" r="0" b="0"/>
-            <wp:wrapNone/>
-            <wp:docPr id="1" name="image3.png"/>
-            <wp:cNvGraphicFramePr/>
-            <a:graphic xmlns:a="http://schemas.openxmlformats.org/drawingml/2006/main">
-              <a:graphicData uri="http://schemas.openxmlformats.org/drawingml/2006/picture">
-                <pic:pic xmlns:pic="http://schemas.openxmlformats.org/drawingml/2006/picture">
-                  <pic:nvPicPr>
-                    <pic:cNvPr id="0" name="image3.png"/>
-                    <pic:cNvPicPr preferRelativeResize="0"/>
-                  </pic:nvPicPr>
-                  <pic:blipFill>
-                    <a:blip r:embed="rId5" cstate="print"/>
-                    <a:srcRect/>
-                    <a:stretch>
-                      <a:fillRect/>
-                    </a:stretch>
-                  </pic:blipFill>
-                  <pic:spPr>
-                    <a:xfrm>
-                      <a:off x="0" y="0"/>
-                      <a:ext cx="595313" cy="194621"/>
-                    </a:xfrm>
-                    <a:prstGeom prst="rect">
-                      <a:avLst/>
-                    </a:prstGeom>
-                    <a:ln/>
-                  </pic:spPr>
-                </pic:pic>
-              </a:graphicData>
-            </a:graphic>
-          </wp:anchor>
-        </w:drawing>
-      </w:r>
-    </w:p>
-    <w:p>
-      <w:pPr>
-        <w:pStyle w:val="Normal1"/>
-        <w:jc w:val="center"/>
-        <w:rPr>
           <w:b/>
         </w:rPr>
-      </w:pPr>
+        <w:t xml:space="preserve">Team </w:t>
+      </w:r>
       <w:r>
         <w:rPr>
           <w:b/>
         </w:rPr>
-        <w:t>Team Sheet Template for Romania Academy Clubs</w:t>
+        <w:t>s</w:t>
       </w:r>
-    </w:p>
-    <w:p>
-      <w:pPr>
-        <w:pStyle w:val="Normal1"/>
-        <w:jc w:val="center"/>
-      </w:pPr>
+      <w:r>
+        <w:rPr>
+          <w:b/>
+        </w:rPr>
+        <w:t>heet for Romania</w:t>
+      </w:r>
+      <w:r>
+        <w:rPr>
+          <w:b/>
+        </w:rPr>
+        <w:t>n</w:t>
+      </w:r>
+      <w:r>
+        <w:rPr>
+          <w:b/>
+        </w:rPr>
+        <w:t xml:space="preserve"> </w:t>
+      </w:r>
+      <w:r>
+        <w:rPr>
+          <w:b/>
+        </w:rPr>
+        <w:t>a</w:t>
+      </w:r>
+      <w:r>
+        <w:rPr>
+          <w:b/>
+        </w:rPr>
+        <w:t xml:space="preserve">cademy </w:t>
+      </w:r>
+      <w:r>
+        <w:rPr>
+          <w:b/>
+        </w:rPr>
+        <w:t>matches</w:t>
+      </w:r>
       <w:r>
         <w:rPr>
           <w:noProof/>
@@ -131,11 +132,6 @@
           <v:rect id="_x0000_i1025" alt="" style="width:451.3pt;height:.05pt;mso-width-percent:0;mso-height-percent:0;mso-width-percent:0;mso-height-percent:0" o:hralign="center" o:hrstd="t" o:hr="t" fillcolor="#a0a0a0" stroked="f"/>
         </w:pict>
       </w:r>
-    </w:p>
-    <w:p>
-      <w:pPr>
-        <w:pStyle w:val="Normal1"/>
-      </w:pPr>
     </w:p>
     <w:tbl>
       <w:tblPr>
@@ -162,6 +158,7 @@
       <w:tr>
         <w:trPr>
           <w:cantSplit/>
+          <w:trHeight w:val="283"/>
           <w:tblHeader/>
           <w:jc w:val="center"/>
         </w:trPr>
@@ -297,39 +294,7 @@
                 <w:bCs/>
                 <w:color w:val="FF0000"/>
               </w:rPr>
-              <w:t>DD</w:t>
-            </w:r>
-            <w:r>
-              <w:rPr>
-                <w:b/>
-                <w:bCs/>
-                <w:color w:val="FF0000"/>
-              </w:rPr>
-              <w:t>/</w:t>
-            </w:r>
-            <w:r>
-              <w:rPr>
-                <w:b/>
-                <w:bCs/>
-                <w:color w:val="FF0000"/>
-              </w:rPr>
-              <w:t>MM</w:t>
-            </w:r>
-            <w:r>
-              <w:rPr>
-                <w:b/>
-                <w:bCs/>
-                <w:color w:val="FF0000"/>
-              </w:rPr>
-              <w:t>/</w:t>
-            </w:r>
-            <w:r>
-              <w:rPr>
-                <w:b/>
-                <w:bCs/>
-                <w:color w:val="FF0000"/>
-              </w:rPr>
-              <w:t>YY</w:t>
+              <w:t>DD/MM/YY</w:t>
             </w:r>
           </w:p>
         </w:tc>
@@ -337,6 +302,7 @@
       <w:tr>
         <w:trPr>
           <w:cantSplit/>
+          <w:trHeight w:val="283"/>
           <w:tblHeader/>
           <w:jc w:val="center"/>
         </w:trPr>
@@ -363,10 +329,6 @@
                 <w:between w:val="nil"/>
               </w:pBdr>
               <w:spacing w:line="240" w:lineRule="auto"/>
-              <w:rPr>
-                <w:sz w:val="14"/>
-                <w:szCs w:val="14"/>
-              </w:rPr>
             </w:pPr>
             <w:r>
               <w:t xml:space="preserve">Scoreline </w:t>
@@ -500,54 +462,6 @@
       <w:pPr>
         <w:pStyle w:val="Normal1"/>
       </w:pPr>
-      <w:r>
-        <w:rPr>
-          <w:noProof/>
-        </w:rPr>
-        <w:drawing>
-          <wp:anchor distT="114300" distB="114300" distL="114300" distR="114300" simplePos="0" relativeHeight="251660288" behindDoc="1" locked="0" layoutInCell="1" allowOverlap="1" wp14:anchorId="03C81AEB" wp14:editId="2EBD538F">
-            <wp:simplePos x="0" y="0"/>
-            <wp:positionH relativeFrom="page">
-              <wp:posOffset>7053263</wp:posOffset>
-            </wp:positionH>
-            <wp:positionV relativeFrom="page">
-              <wp:posOffset>9286875</wp:posOffset>
-            </wp:positionV>
-            <wp:extent cx="566738" cy="566738"/>
-            <wp:effectExtent l="0" t="0" r="0" b="0"/>
-            <wp:wrapNone/>
-            <wp:docPr id="3" name="image2.png"/>
-            <wp:cNvGraphicFramePr/>
-            <a:graphic xmlns:a="http://schemas.openxmlformats.org/drawingml/2006/main">
-              <a:graphicData uri="http://schemas.openxmlformats.org/drawingml/2006/picture">
-                <pic:pic xmlns:pic="http://schemas.openxmlformats.org/drawingml/2006/picture">
-                  <pic:nvPicPr>
-                    <pic:cNvPr id="0" name="image2.png"/>
-                    <pic:cNvPicPr preferRelativeResize="0"/>
-                  </pic:nvPicPr>
-                  <pic:blipFill>
-                    <a:blip r:embed="rId6" cstate="print"/>
-                    <a:srcRect/>
-                    <a:stretch>
-                      <a:fillRect/>
-                    </a:stretch>
-                  </pic:blipFill>
-                  <pic:spPr>
-                    <a:xfrm>
-                      <a:off x="0" y="0"/>
-                      <a:ext cx="566738" cy="566738"/>
-                    </a:xfrm>
-                    <a:prstGeom prst="rect">
-                      <a:avLst/>
-                    </a:prstGeom>
-                    <a:ln/>
-                  </pic:spPr>
-                </pic:pic>
-              </a:graphicData>
-            </a:graphic>
-          </wp:anchor>
-        </w:drawing>
-      </w:r>
     </w:p>
     <w:tbl>
       <w:tblPr>
@@ -575,6 +489,7 @@
       <w:tr>
         <w:trPr>
           <w:cantSplit/>
+          <w:trHeight w:val="283"/>
           <w:tblHeader/>
           <w:jc w:val="center"/>
         </w:trPr>
@@ -752,6 +667,7 @@
       <w:tr>
         <w:trPr>
           <w:cantSplit/>
+          <w:trHeight w:val="283"/>
           <w:tblHeader/>
           <w:jc w:val="center"/>
         </w:trPr>
@@ -927,7 +843,7 @@
       <w:tr>
         <w:trPr>
           <w:cantSplit/>
-          <w:trHeight w:val="447"/>
+          <w:trHeight w:val="283"/>
           <w:tblHeader/>
           <w:jc w:val="center"/>
         </w:trPr>
@@ -1014,40 +930,30 @@
             <w:r>
               <w:rPr>
                 <w:color w:val="999999"/>
-                <w:sz w:val="20"/>
-                <w:szCs w:val="20"/>
               </w:rPr>
               <w:br/>
             </w:r>
             <w:r>
               <w:rPr>
                 <w:color w:val="999999"/>
-                <w:sz w:val="20"/>
-                <w:szCs w:val="20"/>
               </w:rPr>
               <w:br/>
             </w:r>
             <w:r>
               <w:rPr>
                 <w:color w:val="999999"/>
-                <w:sz w:val="20"/>
-                <w:szCs w:val="20"/>
               </w:rPr>
               <w:br/>
             </w:r>
             <w:r>
               <w:rPr>
                 <w:color w:val="999999"/>
-                <w:sz w:val="20"/>
-                <w:szCs w:val="20"/>
               </w:rPr>
               <w:br/>
             </w:r>
             <w:r>
               <w:rPr>
                 <w:color w:val="999999"/>
-                <w:sz w:val="20"/>
-                <w:szCs w:val="20"/>
               </w:rPr>
               <w:br/>
               <w:t>S</w:t>
@@ -1055,8 +961,6 @@
             <w:r>
               <w:rPr>
                 <w:color w:val="999999"/>
-                <w:sz w:val="20"/>
-                <w:szCs w:val="20"/>
               </w:rPr>
               <w:br/>
               <w:t>T</w:t>
@@ -1064,8 +968,6 @@
             <w:r>
               <w:rPr>
                 <w:color w:val="999999"/>
-                <w:sz w:val="20"/>
-                <w:szCs w:val="20"/>
               </w:rPr>
               <w:br/>
               <w:t>A</w:t>
@@ -1073,8 +975,6 @@
             <w:r>
               <w:rPr>
                 <w:color w:val="999999"/>
-                <w:sz w:val="20"/>
-                <w:szCs w:val="20"/>
               </w:rPr>
               <w:br/>
               <w:t>R</w:t>
@@ -1082,8 +982,6 @@
             <w:r>
               <w:rPr>
                 <w:color w:val="999999"/>
-                <w:sz w:val="20"/>
-                <w:szCs w:val="20"/>
               </w:rPr>
               <w:br/>
               <w:t>T</w:t>
@@ -1091,8 +989,6 @@
             <w:r>
               <w:rPr>
                 <w:color w:val="999999"/>
-                <w:sz w:val="20"/>
-                <w:szCs w:val="20"/>
               </w:rPr>
               <w:br/>
               <w:t>I</w:t>
@@ -1100,8 +996,6 @@
             <w:r>
               <w:rPr>
                 <w:color w:val="999999"/>
-                <w:sz w:val="20"/>
-                <w:szCs w:val="20"/>
               </w:rPr>
               <w:br/>
               <w:t>N</w:t>
@@ -1109,8 +1003,6 @@
             <w:r>
               <w:rPr>
                 <w:color w:val="999999"/>
-                <w:sz w:val="20"/>
-                <w:szCs w:val="20"/>
               </w:rPr>
               <w:br/>
               <w:t>G</w:t>
@@ -1118,16 +1010,12 @@
             <w:r>
               <w:rPr>
                 <w:color w:val="999999"/>
-                <w:sz w:val="20"/>
-                <w:szCs w:val="20"/>
               </w:rPr>
               <w:br/>
             </w:r>
             <w:r>
               <w:rPr>
                 <w:color w:val="999999"/>
-                <w:sz w:val="20"/>
-                <w:szCs w:val="20"/>
               </w:rPr>
               <w:br/>
               <w:t>X</w:t>
@@ -1135,8 +1023,6 @@
             <w:r>
               <w:rPr>
                 <w:color w:val="999999"/>
-                <w:sz w:val="20"/>
-                <w:szCs w:val="20"/>
               </w:rPr>
               <w:br/>
               <w:t>I</w:t>
@@ -1205,7 +1091,7 @@
       <w:tr>
         <w:trPr>
           <w:cantSplit/>
-          <w:trHeight w:val="420"/>
+          <w:trHeight w:val="283"/>
           <w:tblHeader/>
           <w:jc w:val="center"/>
         </w:trPr>
@@ -1360,7 +1246,7 @@
       <w:tr>
         <w:trPr>
           <w:cantSplit/>
-          <w:trHeight w:val="420"/>
+          <w:trHeight w:val="283"/>
           <w:tblHeader/>
           <w:jc w:val="center"/>
         </w:trPr>
@@ -1515,7 +1401,7 @@
       <w:tr>
         <w:trPr>
           <w:cantSplit/>
-          <w:trHeight w:val="420"/>
+          <w:trHeight w:val="283"/>
           <w:tblHeader/>
           <w:jc w:val="center"/>
         </w:trPr>
@@ -1670,7 +1556,7 @@
       <w:tr>
         <w:trPr>
           <w:cantSplit/>
-          <w:trHeight w:val="420"/>
+          <w:trHeight w:val="283"/>
           <w:tblHeader/>
           <w:jc w:val="center"/>
         </w:trPr>
@@ -1825,7 +1711,7 @@
       <w:tr>
         <w:trPr>
           <w:cantSplit/>
-          <w:trHeight w:val="420"/>
+          <w:trHeight w:val="283"/>
           <w:tblHeader/>
           <w:jc w:val="center"/>
         </w:trPr>
@@ -1980,7 +1866,7 @@
       <w:tr>
         <w:trPr>
           <w:cantSplit/>
-          <w:trHeight w:val="420"/>
+          <w:trHeight w:val="283"/>
           <w:tblHeader/>
           <w:jc w:val="center"/>
         </w:trPr>
@@ -2135,7 +2021,7 @@
       <w:tr>
         <w:trPr>
           <w:cantSplit/>
-          <w:trHeight w:val="420"/>
+          <w:trHeight w:val="283"/>
           <w:tblHeader/>
           <w:jc w:val="center"/>
         </w:trPr>
@@ -2290,7 +2176,7 @@
       <w:tr>
         <w:trPr>
           <w:cantSplit/>
-          <w:trHeight w:val="420"/>
+          <w:trHeight w:val="283"/>
           <w:tblHeader/>
           <w:jc w:val="center"/>
         </w:trPr>
@@ -2445,7 +2331,7 @@
       <w:tr>
         <w:trPr>
           <w:cantSplit/>
-          <w:trHeight w:val="420"/>
+          <w:trHeight w:val="283"/>
           <w:tblHeader/>
           <w:jc w:val="center"/>
         </w:trPr>
@@ -2600,7 +2486,7 @@
       <w:tr>
         <w:trPr>
           <w:cantSplit/>
-          <w:trHeight w:val="420"/>
+          <w:trHeight w:val="283"/>
           <w:tblHeader/>
           <w:jc w:val="center"/>
         </w:trPr>
@@ -2755,7 +2641,7 @@
       <w:tr>
         <w:trPr>
           <w:cantSplit/>
-          <w:trHeight w:val="420"/>
+          <w:trHeight w:val="283"/>
           <w:tblHeader/>
           <w:jc w:val="center"/>
         </w:trPr>
@@ -2849,31 +2735,23 @@
               <w:jc w:val="center"/>
               <w:rPr>
                 <w:color w:val="999999"/>
-                <w:sz w:val="20"/>
-                <w:szCs w:val="20"/>
               </w:rPr>
             </w:pPr>
             <w:r>
               <w:rPr>
                 <w:color w:val="999999"/>
-                <w:sz w:val="20"/>
-                <w:szCs w:val="20"/>
               </w:rPr>
               <w:br/>
             </w:r>
             <w:r>
               <w:rPr>
                 <w:color w:val="999999"/>
-                <w:sz w:val="20"/>
-                <w:szCs w:val="20"/>
               </w:rPr>
               <w:br/>
             </w:r>
             <w:r>
               <w:rPr>
                 <w:color w:val="999999"/>
-                <w:sz w:val="20"/>
-                <w:szCs w:val="20"/>
               </w:rPr>
               <w:br/>
               <w:t>S</w:t>
@@ -2881,8 +2759,6 @@
             <w:r>
               <w:rPr>
                 <w:color w:val="999999"/>
-                <w:sz w:val="20"/>
-                <w:szCs w:val="20"/>
               </w:rPr>
               <w:br/>
               <w:t>U</w:t>
@@ -2890,8 +2766,6 @@
             <w:r>
               <w:rPr>
                 <w:color w:val="999999"/>
-                <w:sz w:val="20"/>
-                <w:szCs w:val="20"/>
               </w:rPr>
               <w:br/>
               <w:t>B</w:t>
@@ -2899,8 +2773,6 @@
             <w:r>
               <w:rPr>
                 <w:color w:val="999999"/>
-                <w:sz w:val="20"/>
-                <w:szCs w:val="20"/>
               </w:rPr>
               <w:br/>
               <w:t>S</w:t>
@@ -2908,25 +2780,13 @@
             <w:r>
               <w:rPr>
                 <w:color w:val="999999"/>
-                <w:sz w:val="20"/>
-                <w:szCs w:val="20"/>
               </w:rPr>
               <w:br/>
+              <w:t>T</w:t>
             </w:r>
             <w:r>
               <w:rPr>
                 <w:color w:val="999999"/>
-                <w:sz w:val="20"/>
-                <w:szCs w:val="20"/>
-              </w:rPr>
-              <w:lastRenderedPageBreak/>
-              <w:t>T</w:t>
-            </w:r>
-            <w:r>
-              <w:rPr>
-                <w:color w:val="999999"/>
-                <w:sz w:val="20"/>
-                <w:szCs w:val="20"/>
               </w:rPr>
               <w:br/>
               <w:t>I</w:t>
@@ -2934,8 +2794,6 @@
             <w:r>
               <w:rPr>
                 <w:color w:val="999999"/>
-                <w:sz w:val="20"/>
-                <w:szCs w:val="20"/>
               </w:rPr>
               <w:br/>
               <w:t>T</w:t>
@@ -2943,8 +2801,6 @@
             <w:r>
               <w:rPr>
                 <w:color w:val="999999"/>
-                <w:sz w:val="20"/>
-                <w:szCs w:val="20"/>
               </w:rPr>
               <w:br/>
               <w:t>U</w:t>
@@ -2952,8 +2808,6 @@
             <w:r>
               <w:rPr>
                 <w:color w:val="999999"/>
-                <w:sz w:val="20"/>
-                <w:szCs w:val="20"/>
               </w:rPr>
               <w:br/>
               <w:t>T</w:t>
@@ -2961,8 +2815,6 @@
             <w:r>
               <w:rPr>
                 <w:color w:val="999999"/>
-                <w:sz w:val="20"/>
-                <w:szCs w:val="20"/>
               </w:rPr>
               <w:br/>
               <w:t>E</w:t>
@@ -2970,8 +2822,6 @@
             <w:r>
               <w:rPr>
                 <w:color w:val="999999"/>
-                <w:sz w:val="20"/>
-                <w:szCs w:val="20"/>
               </w:rPr>
               <w:br/>
               <w:t>S</w:t>
@@ -3007,7 +2857,6 @@
               <w:jc w:val="center"/>
             </w:pPr>
             <w:r>
-              <w:lastRenderedPageBreak/>
               <w:t>NAME</w:t>
             </w:r>
           </w:p>
@@ -3046,7 +2895,7 @@
       <w:tr>
         <w:trPr>
           <w:cantSplit/>
-          <w:trHeight w:val="434"/>
+          <w:trHeight w:val="283"/>
           <w:tblHeader/>
           <w:jc w:val="center"/>
         </w:trPr>
@@ -3205,7 +3054,7 @@
       <w:tr>
         <w:trPr>
           <w:cantSplit/>
-          <w:trHeight w:val="420"/>
+          <w:trHeight w:val="283"/>
           <w:tblHeader/>
           <w:jc w:val="center"/>
         </w:trPr>
@@ -3364,7 +3213,7 @@
       <w:tr>
         <w:trPr>
           <w:cantSplit/>
-          <w:trHeight w:val="420"/>
+          <w:trHeight w:val="283"/>
           <w:tblHeader/>
           <w:jc w:val="center"/>
         </w:trPr>
@@ -3394,7 +3243,6 @@
               <w:jc w:val="center"/>
             </w:pPr>
             <w:r>
-              <w:lastRenderedPageBreak/>
               <w:t>#</w:t>
             </w:r>
           </w:p>
@@ -3524,7 +3372,7 @@
       <w:tr>
         <w:trPr>
           <w:cantSplit/>
-          <w:trHeight w:val="420"/>
+          <w:trHeight w:val="283"/>
           <w:tblHeader/>
           <w:jc w:val="center"/>
         </w:trPr>
@@ -3683,7 +3531,7 @@
       <w:tr>
         <w:trPr>
           <w:cantSplit/>
-          <w:trHeight w:val="420"/>
+          <w:trHeight w:val="283"/>
           <w:tblHeader/>
           <w:jc w:val="center"/>
         </w:trPr>
@@ -3842,7 +3690,7 @@
       <w:tr>
         <w:trPr>
           <w:cantSplit/>
-          <w:trHeight w:val="420"/>
+          <w:trHeight w:val="283"/>
           <w:tblHeader/>
           <w:jc w:val="center"/>
         </w:trPr>
@@ -4001,7 +3849,7 @@
       <w:tr>
         <w:trPr>
           <w:cantSplit/>
-          <w:trHeight w:val="420"/>
+          <w:trHeight w:val="283"/>
           <w:tblHeader/>
           <w:jc w:val="center"/>
         </w:trPr>
@@ -4160,7 +4008,7 @@
       <w:tr>
         <w:trPr>
           <w:cantSplit/>
-          <w:trHeight w:val="420"/>
+          <w:trHeight w:val="283"/>
           <w:tblHeader/>
           <w:jc w:val="center"/>
         </w:trPr>
@@ -4320,17 +4168,67 @@
     <w:p>
       <w:pPr>
         <w:pStyle w:val="Normal1"/>
-        <w:jc w:val="center"/>
       </w:pPr>
     </w:p>
     <w:sectPr>
       <w:pgSz w:w="12240" w:h="15840"/>
-      <w:pgMar w:top="1440" w:right="1440" w:bottom="1440" w:left="1440" w:header="720" w:footer="720" w:gutter="0"/>
+      <w:pgMar w:top="720" w:right="720" w:bottom="720" w:left="720" w:header="720" w:footer="720" w:gutter="0"/>
       <w:pgNumType w:start="1"/>
       <w:cols w:space="720"/>
+      <w:docGrid w:linePitch="299"/>
     </w:sectPr>
   </w:body>
 </w:document>
+</file>
+
+<file path=word/endnotes.xml><?xml version="1.0" encoding="utf-8"?>
+<w:endnotes xmlns:wpc="http://schemas.microsoft.com/office/word/2010/wordprocessingCanvas" xmlns:cx="http://schemas.microsoft.com/office/drawing/2014/chartex" xmlns:cx1="http://schemas.microsoft.com/office/drawing/2015/9/8/chartex" xmlns:cx2="http://schemas.microsoft.com/office/drawing/2015/10/21/chartex" xmlns:cx3="http://schemas.microsoft.com/office/drawing/2016/5/9/chartex" xmlns:cx4="http://schemas.microsoft.com/office/drawing/2016/5/10/chartex" xmlns:cx5="http://schemas.microsoft.com/office/drawing/2016/5/11/chartex" xmlns:cx6="http://schemas.microsoft.com/office/drawing/2016/5/12/chartex" xmlns:cx7="http://schemas.microsoft.com/office/drawing/2016/5/13/chartex" xmlns:cx8="http://schemas.microsoft.com/office/drawing/2016/5/14/chartex" xmlns:mc="http://schemas.openxmlformats.org/markup-compatibility/2006" xmlns:aink="http://schemas.microsoft.com/office/drawing/2016/ink" xmlns:am3d="http://schemas.microsoft.com/office/drawing/2017/model3d" xmlns:o="urn:schemas-microsoft-com:office:office" xmlns:oel="http://schemas.microsoft.com/office/2019/extlst" xmlns:r="http://schemas.openxmlformats.org/officeDocument/2006/relationships" xmlns:m="http://schemas.openxmlformats.org/officeDocument/2006/math" xmlns:v="urn:schemas-microsoft-com:vml" xmlns:wp14="http://schemas.microsoft.com/office/word/2010/wordprocessingDrawing" xmlns:wp="http://schemas.openxmlformats.org/drawingml/2006/wordprocessingDrawing" xmlns:w10="urn:schemas-microsoft-com:office:word" xmlns:w="http://schemas.openxmlformats.org/wordprocessingml/2006/main" xmlns:w14="http://schemas.microsoft.com/office/word/2010/wordml" xmlns:w15="http://schemas.microsoft.com/office/word/2012/wordml" xmlns:w16cei="http://schemas.microsoft.com/office/word/2026/wordml/cei" xmlns:w16cex="http://schemas.microsoft.com/office/word/2018/wordml/cex" xmlns:w16cid="http://schemas.microsoft.com/office/word/2016/wordml/cid" xmlns:w16="http://schemas.microsoft.com/office/word/2018/wordml" xmlns:w16du="http://schemas.microsoft.com/office/word/2023/wordml/word16du" xmlns:w16sdtdh="http://schemas.microsoft.com/office/word/2020/wordml/sdtdatahash" xmlns:w16sdtfl="http://schemas.microsoft.com/office/word/2024/wordml/sdtformatlock" xmlns:w16se="http://schemas.microsoft.com/office/word/2015/wordml/symex" xmlns:wpg="http://schemas.microsoft.com/office/word/2010/wordprocessingGroup" xmlns:wpi="http://schemas.microsoft.com/office/word/2010/wordprocessingInk" xmlns:wne="http://schemas.microsoft.com/office/word/2006/wordml" xmlns:wps="http://schemas.microsoft.com/office/word/2010/wordprocessingShape" mc:Ignorable="w14 w15 w16se w16cid w16 w16cex w16sdtdh w16sdtfl w16du wp14">
+  <w:endnote w:type="separator" w:id="-1">
+    <w:p>
+      <w:pPr>
+        <w:spacing w:line="240" w:lineRule="auto"/>
+      </w:pPr>
+      <w:r>
+        <w:separator/>
+      </w:r>
+    </w:p>
+  </w:endnote>
+  <w:endnote w:type="continuationSeparator" w:id="0">
+    <w:p>
+      <w:pPr>
+        <w:spacing w:line="240" w:lineRule="auto"/>
+      </w:pPr>
+      <w:r>
+        <w:continuationSeparator/>
+      </w:r>
+    </w:p>
+  </w:endnote>
+</w:endnotes>
+</file>
+
+<file path=word/footnotes.xml><?xml version="1.0" encoding="utf-8"?>
+<w:footnotes xmlns:wpc="http://schemas.microsoft.com/office/word/2010/wordprocessingCanvas" xmlns:cx="http://schemas.microsoft.com/office/drawing/2014/chartex" xmlns:cx1="http://schemas.microsoft.com/office/drawing/2015/9/8/chartex" xmlns:cx2="http://schemas.microsoft.com/office/drawing/2015/10/21/chartex" xmlns:cx3="http://schemas.microsoft.com/office/drawing/2016/5/9/chartex" xmlns:cx4="http://schemas.microsoft.com/office/drawing/2016/5/10/chartex" xmlns:cx5="http://schemas.microsoft.com/office/drawing/2016/5/11/chartex" xmlns:cx6="http://schemas.microsoft.com/office/drawing/2016/5/12/chartex" xmlns:cx7="http://schemas.microsoft.com/office/drawing/2016/5/13/chartex" xmlns:cx8="http://schemas.microsoft.com/office/drawing/2016/5/14/chartex" xmlns:mc="http://schemas.openxmlformats.org/markup-compatibility/2006" xmlns:aink="http://schemas.microsoft.com/office/drawing/2016/ink" xmlns:am3d="http://schemas.microsoft.com/office/drawing/2017/model3d" xmlns:o="urn:schemas-microsoft-com:office:office" xmlns:oel="http://schemas.microsoft.com/office/2019/extlst" xmlns:r="http://schemas.openxmlformats.org/officeDocument/2006/relationships" xmlns:m="http://schemas.openxmlformats.org/officeDocument/2006/math" xmlns:v="urn:schemas-microsoft-com:vml" xmlns:wp14="http://schemas.microsoft.com/office/word/2010/wordprocessingDrawing" xmlns:wp="http://schemas.openxmlformats.org/drawingml/2006/wordprocessingDrawing" xmlns:w10="urn:schemas-microsoft-com:office:word" xmlns:w="http://schemas.openxmlformats.org/wordprocessingml/2006/main" xmlns:w14="http://schemas.microsoft.com/office/word/2010/wordml" xmlns:w15="http://schemas.microsoft.com/office/word/2012/wordml" xmlns:w16cei="http://schemas.microsoft.com/office/word/2026/wordml/cei" xmlns:w16cex="http://schemas.microsoft.com/office/word/2018/wordml/cex" xmlns:w16cid="http://schemas.microsoft.com/office/word/2016/wordml/cid" xmlns:w16="http://schemas.microsoft.com/office/word/2018/wordml" xmlns:w16du="http://schemas.microsoft.com/office/word/2023/wordml/word16du" xmlns:w16sdtdh="http://schemas.microsoft.com/office/word/2020/wordml/sdtdatahash" xmlns:w16sdtfl="http://schemas.microsoft.com/office/word/2024/wordml/sdtformatlock" xmlns:w16se="http://schemas.microsoft.com/office/word/2015/wordml/symex" xmlns:wpg="http://schemas.microsoft.com/office/word/2010/wordprocessingGroup" xmlns:wpi="http://schemas.microsoft.com/office/word/2010/wordprocessingInk" xmlns:wne="http://schemas.microsoft.com/office/word/2006/wordml" xmlns:wps="http://schemas.microsoft.com/office/word/2010/wordprocessingShape" mc:Ignorable="w14 w15 w16se w16cid w16 w16cex w16sdtdh w16sdtfl w16du wp14">
+  <w:footnote w:type="separator" w:id="-1">
+    <w:p>
+      <w:pPr>
+        <w:spacing w:line="240" w:lineRule="auto"/>
+      </w:pPr>
+      <w:r>
+        <w:separator/>
+      </w:r>
+    </w:p>
+  </w:footnote>
+  <w:footnote w:type="continuationSeparator" w:id="0">
+    <w:p>
+      <w:pPr>
+        <w:spacing w:line="240" w:lineRule="auto"/>
+      </w:pPr>
+      <w:r>
+        <w:continuationSeparator/>
+      </w:r>
+    </w:p>
+  </w:footnote>
+</w:footnotes>
 </file>
 
 <file path=word/styles.xml><?xml version="1.0" encoding="utf-8"?>
@@ -4920,6 +4818,50 @@
       </w:tblCellMar>
     </w:tblPr>
   </w:style>
+  <w:style w:type="paragraph" w:styleId="Header">
+    <w:name w:val="header"/>
+    <w:basedOn w:val="Normal"/>
+    <w:link w:val="HeaderChar"/>
+    <w:uiPriority w:val="99"/>
+    <w:unhideWhenUsed/>
+    <w:rsid w:val="00610873"/>
+    <w:pPr>
+      <w:tabs>
+        <w:tab w:val="center" w:pos="4513"/>
+        <w:tab w:val="right" w:pos="9026"/>
+      </w:tabs>
+      <w:spacing w:line="240" w:lineRule="auto"/>
+    </w:pPr>
+  </w:style>
+  <w:style w:type="character" w:customStyle="1" w:styleId="HeaderChar">
+    <w:name w:val="Header Char"/>
+    <w:basedOn w:val="DefaultParagraphFont"/>
+    <w:link w:val="Header"/>
+    <w:uiPriority w:val="99"/>
+    <w:rsid w:val="00610873"/>
+  </w:style>
+  <w:style w:type="paragraph" w:styleId="Footer">
+    <w:name w:val="footer"/>
+    <w:basedOn w:val="Normal"/>
+    <w:link w:val="FooterChar"/>
+    <w:uiPriority w:val="99"/>
+    <w:unhideWhenUsed/>
+    <w:rsid w:val="00610873"/>
+    <w:pPr>
+      <w:tabs>
+        <w:tab w:val="center" w:pos="4513"/>
+        <w:tab w:val="right" w:pos="9026"/>
+      </w:tabs>
+      <w:spacing w:line="240" w:lineRule="auto"/>
+    </w:pPr>
+  </w:style>
+  <w:style w:type="character" w:customStyle="1" w:styleId="FooterChar">
+    <w:name w:val="Footer Char"/>
+    <w:basedOn w:val="DefaultParagraphFont"/>
+    <w:link w:val="Footer"/>
+    <w:uiPriority w:val="99"/>
+    <w:rsid w:val="00610873"/>
+  </w:style>
 </w:styles>
 </file>
 
@@ -5241,4 +5183,16 @@
   </a:objectDefaults>
   <a:extraClrSchemeLst/>
 </a:theme>
+</file>
+
+<file path=customXml/item1.xml><?xml version="1.0" encoding="utf-8"?>
+<b:Sources xmlns:b="http://schemas.openxmlformats.org/officeDocument/2006/bibliography" xmlns="http://schemas.openxmlformats.org/officeDocument/2006/bibliography" SelectedStyle="\APASixthEditionOfficeOnline.xsl" StyleName="APA" Version="6"/>
+</file>
+
+<file path=customXml/itemProps1.xml><?xml version="1.0" encoding="utf-8"?>
+<ds:datastoreItem xmlns:ds="http://schemas.openxmlformats.org/officeDocument/2006/customXml" ds:itemID="{12ACA0E7-7B60-4D4E-907F-3E1394740A07}">
+  <ds:schemaRefs>
+    <ds:schemaRef ds:uri="http://schemas.openxmlformats.org/officeDocument/2006/bibliography"/>
+  </ds:schemaRefs>
+</ds:datastoreItem>
 </file>
</xml_diff>